<commit_message>
Update task4 turtle strategy interactivity
</commit_message>
<xml_diff>
--- a/TASK4/程冰晖 TASK4.docx
+++ b/TASK4/程冰晖 TASK4.docx
@@ -1232,7 +1232,7 @@
                 <w:b w:val="0"/>
                 <w:sz w:val="19"/>
               </w:rPr>
-              <w:t>-19.72%</w:t>
+              <w:t>-15.94%</w:t>
             </w:r>
           </w:p>
         </w:tc>
@@ -1398,7 +1398,7 @@
                 <w:b w:val="0"/>
                 <w:sz w:val="19"/>
               </w:rPr>
-              <w:t>-31.30%</w:t>
+              <w:t>-26.78%</w:t>
             </w:r>
           </w:p>
         </w:tc>
@@ -1564,7 +1564,7 @@
                 <w:b w:val="0"/>
                 <w:sz w:val="19"/>
               </w:rPr>
-              <w:t>-7.13%</w:t>
+              <w:t>-2.06%</w:t>
             </w:r>
           </w:p>
         </w:tc>
@@ -1730,7 +1730,7 @@
                 <w:b w:val="0"/>
                 <w:sz w:val="19"/>
               </w:rPr>
-              <w:t>62.70%</w:t>
+              <w:t>56.77%</w:t>
             </w:r>
           </w:p>
         </w:tc>
@@ -1896,7 +1896,7 @@
                 <w:b w:val="0"/>
                 <w:sz w:val="19"/>
               </w:rPr>
-              <w:t>79.21%</w:t>
+              <w:t>51.86%</w:t>
             </w:r>
           </w:p>
         </w:tc>
@@ -1924,6 +1924,172 @@
                 <w:sz w:val="19"/>
               </w:rPr>
               <w:t>9</w:t>
+            </w:r>
+          </w:p>
+        </w:tc>
+      </w:tr>
+      <w:tr>
+        <w:tc>
+          <w:tcPr>
+            <w:tcW w:type="dxa" w:w="2520"/>
+            <w:vAlign w:val="center"/>
+            <w:tcMar>
+              <w:top w:w="80" w:type="dxa"/>
+              <w:start w:w="120" w:type="dxa"/>
+              <w:bottom w:w="80" w:type="dxa"/>
+              <w:end w:w="120" w:type="dxa"/>
+            </w:tcMar>
+          </w:tcPr>
+          <w:p>
+            <w:pPr>
+              <w:spacing w:line="360" w:lineRule="auto" w:before="0" w:after="0"/>
+              <w:ind w:firstLine="0"/>
+              <w:jc w:val="center"/>
+            </w:pPr>
+            <w:r>
+              <w:rPr>
+                <w:rFonts w:ascii="宋体" w:hAnsi="宋体" w:eastAsia="宋体"/>
+                <w:b w:val="0"/>
+                <w:sz w:val="19"/>
+              </w:rPr>
+              <w:t>中际旭创A股</w:t>
+              <w:br/>
+              <w:t>300308.SZ</w:t>
+            </w:r>
+          </w:p>
+        </w:tc>
+        <w:tc>
+          <w:tcPr>
+            <w:tcW w:type="dxa" w:w="1368"/>
+            <w:vAlign w:val="center"/>
+            <w:tcMar>
+              <w:top w:w="80" w:type="dxa"/>
+              <w:start w:w="120" w:type="dxa"/>
+              <w:bottom w:w="80" w:type="dxa"/>
+              <w:end w:w="120" w:type="dxa"/>
+            </w:tcMar>
+          </w:tcPr>
+          <w:p>
+            <w:pPr>
+              <w:spacing w:line="360" w:lineRule="auto" w:before="0" w:after="0"/>
+              <w:ind w:firstLine="0"/>
+              <w:jc w:val="center"/>
+            </w:pPr>
+            <w:r>
+              <w:rPr>
+                <w:rFonts w:ascii="宋体" w:hAnsi="宋体" w:eastAsia="宋体"/>
+                <w:b w:val="0"/>
+                <w:sz w:val="19"/>
+              </w:rPr>
+              <w:t>20.12%</w:t>
+            </w:r>
+          </w:p>
+        </w:tc>
+        <w:tc>
+          <w:tcPr>
+            <w:tcW w:type="dxa" w:w="1368"/>
+            <w:vAlign w:val="center"/>
+            <w:tcMar>
+              <w:top w:w="80" w:type="dxa"/>
+              <w:start w:w="120" w:type="dxa"/>
+              <w:bottom w:w="80" w:type="dxa"/>
+              <w:end w:w="120" w:type="dxa"/>
+            </w:tcMar>
+          </w:tcPr>
+          <w:p>
+            <w:pPr>
+              <w:spacing w:line="360" w:lineRule="auto" w:before="0" w:after="0"/>
+              <w:ind w:firstLine="0"/>
+              <w:jc w:val="center"/>
+            </w:pPr>
+            <w:r>
+              <w:rPr>
+                <w:rFonts w:ascii="宋体" w:hAnsi="宋体" w:eastAsia="宋体"/>
+                <w:b w:val="0"/>
+                <w:sz w:val="19"/>
+              </w:rPr>
+              <w:t>-3.32%</w:t>
+            </w:r>
+          </w:p>
+        </w:tc>
+        <w:tc>
+          <w:tcPr>
+            <w:tcW w:type="dxa" w:w="1224"/>
+            <w:vAlign w:val="center"/>
+            <w:tcMar>
+              <w:top w:w="80" w:type="dxa"/>
+              <w:start w:w="120" w:type="dxa"/>
+              <w:bottom w:w="80" w:type="dxa"/>
+              <w:end w:w="120" w:type="dxa"/>
+            </w:tcMar>
+          </w:tcPr>
+          <w:p>
+            <w:pPr>
+              <w:spacing w:line="360" w:lineRule="auto" w:before="0" w:after="0"/>
+              <w:ind w:firstLine="0"/>
+              <w:jc w:val="center"/>
+            </w:pPr>
+            <w:r>
+              <w:rPr>
+                <w:rFonts w:ascii="宋体" w:hAnsi="宋体" w:eastAsia="宋体"/>
+                <w:b w:val="0"/>
+                <w:sz w:val="19"/>
+              </w:rPr>
+              <w:t>2.19</w:t>
+            </w:r>
+          </w:p>
+        </w:tc>
+        <w:tc>
+          <w:tcPr>
+            <w:tcW w:type="dxa" w:w="1368"/>
+            <w:vAlign w:val="center"/>
+            <w:tcMar>
+              <w:top w:w="80" w:type="dxa"/>
+              <w:start w:w="120" w:type="dxa"/>
+              <w:bottom w:w="80" w:type="dxa"/>
+              <w:end w:w="120" w:type="dxa"/>
+            </w:tcMar>
+          </w:tcPr>
+          <w:p>
+            <w:pPr>
+              <w:spacing w:line="360" w:lineRule="auto" w:before="0" w:after="0"/>
+              <w:ind w:firstLine="0"/>
+              <w:jc w:val="center"/>
+            </w:pPr>
+            <w:r>
+              <w:rPr>
+                <w:rFonts w:ascii="宋体" w:hAnsi="宋体" w:eastAsia="宋体"/>
+                <w:b w:val="0"/>
+                <w:sz w:val="19"/>
+              </w:rPr>
+              <w:t>554.96%</w:t>
+            </w:r>
+          </w:p>
+        </w:tc>
+        <w:tc>
+          <w:tcPr>
+            <w:tcW w:type="dxa" w:w="1080"/>
+            <w:vAlign w:val="center"/>
+            <w:tcMar>
+              <w:top w:w="80" w:type="dxa"/>
+              <w:start w:w="120" w:type="dxa"/>
+              <w:bottom w:w="80" w:type="dxa"/>
+              <w:end w:w="120" w:type="dxa"/>
+            </w:tcMar>
+          </w:tcPr>
+          <w:p>
+            <w:pPr>
+              <w:spacing w:line="360" w:lineRule="auto" w:before="0" w:after="0"/>
+              <w:ind w:firstLine="0"/>
+              <w:jc w:val="center"/>
+            </w:pPr>
+            <w:r>
+              <w:rPr>
+                <w:rFonts w:ascii="宋体" w:hAnsi="宋体" w:eastAsia="宋体"/>
+                <w:b w:val="0"/>
+                <w:sz w:val="19"/>
+              </w:rPr>
+              <w:t>7</w:t>
             </w:r>
           </w:p>
         </w:tc>

</xml_diff>